<commit_message>
update first code ubuntu
</commit_message>
<xml_diff>
--- a/public/template/CN_HD_TM_DOWN.docx
+++ b/public/template/CN_HD_TM_DOWN.docx
@@ -117,7 +117,7 @@
           <w:sz w:val="22"/>
           <w:szCs w:val="22"/>
         </w:rPr>
-        <w:t>541.NX4/01/2025/HĐMB-PA</w:t>
+        <w:t>152.KS2026/06/2026/HĐMB-PA</w:t>
       </w:r>
     </w:p>
     <w:p>
@@ -228,7 +228,7 @@
           <w:iCs/>
           <w:szCs w:val="22"/>
         </w:rPr>
-        <w:t>09</w:t>
+        <w:t>18</w:t>
       </w:r>
       <w:r>
         <w:rPr>
@@ -246,7 +246,7 @@
           <w:iCs/>
           <w:szCs w:val="22"/>
         </w:rPr>
-        <w:t>01</w:t>
+        <w:t>06</w:t>
       </w:r>
       <w:r>
         <w:rPr>
@@ -264,7 +264,7 @@
           <w:iCs/>
           <w:szCs w:val="22"/>
         </w:rPr>
-        <w:t xml:space="preserve">2025 </w:t>
+        <w:t xml:space="preserve">2026 </w:t>
       </w:r>
       <w:r>
         <w:rPr>
@@ -616,6 +616,14 @@
           <w:sz w:val="22"/>
           <w:szCs w:val="22"/>
         </w:rPr>
+        <w:t xml:space="preserve"> </w:t>
+      </w:r>
+      <w:r>
+        <w:rPr>
+          <w:rFonts w:ascii="TCM Pro" w:hAnsi="TCM Pro" w:cs="Arial"/>
+          <w:sz w:val="22"/>
+          <w:szCs w:val="22"/>
+        </w:rPr>
         <w:tab/>
         <w:t xml:space="preserve">:  </w:t>
       </w:r>
@@ -635,7 +643,15 @@
           <w:szCs w:val="22"/>
         </w:rPr>
         <w:tab/>
-        <w:t>Chức vụ:  Giám đốc.</w:t>
+        <w:t>Chức vụ:  Giám đốc</w:t>
+      </w:r>
+      <w:r>
+        <w:rPr>
+          <w:rFonts w:ascii="TCM Pro" w:hAnsi="TCM Pro" w:cs="Arial"/>
+          <w:sz w:val="22"/>
+          <w:szCs w:val="22"/>
+        </w:rPr>
+        <w:t>.</w:t>
       </w:r>
     </w:p>
     <w:p>
@@ -650,7 +666,6 @@
           <w:rFonts w:ascii="Hyundai Sans Text" w:hAnsi="Hyundai Sans Text" w:cs="Arial"/>
           <w:sz w:val="22"/>
           <w:szCs w:val="22"/>
-          <w:lang w:val="vi-VN"/>
         </w:rPr>
       </w:pPr>
       <w:r>
@@ -691,33 +706,16 @@
           <w:sz w:val="22"/>
           <w:szCs w:val="22"/>
         </w:rPr>
-        <w:t xml:space="preserve">  </w:t>
+        <w:t xml:space="preserve">  Tài khoản (1)</w:t>
       </w:r>
       <w:r>
         <w:rPr>
           <w:rFonts w:ascii="Hyundai Sans Text" w:hAnsi="Hyundai Sans Text" w:cs="Arial"/>
           <w:sz w:val="22"/>
           <w:szCs w:val="22"/>
-          <w:lang w:val="vi-VN"/>
-        </w:rPr>
-        <w:t>Tài khoản</w:t>
-      </w:r>
-      <w:r>
-        <w:rPr>
-          <w:rFonts w:ascii="Hyundai Sans Text" w:hAnsi="Hyundai Sans Text" w:cs="Arial"/>
-          <w:sz w:val="22"/>
-          <w:szCs w:val="22"/>
-        </w:rPr>
-        <w:t xml:space="preserve"> (1)</w:t>
-      </w:r>
-      <w:r>
-        <w:rPr>
-          <w:rFonts w:ascii="Hyundai Sans Text" w:hAnsi="Hyundai Sans Text" w:cs="Arial"/>
-          <w:sz w:val="22"/>
-          <w:szCs w:val="22"/>
         </w:rPr>
         <w:tab/>
-        <w:t>: 54 0000 68 66666  - Tại ngân hàng TMCP Xăng dầu ( Petrolimex) - CN An Giang</w:t>
+        <w:t>: 54 0000 68 66666  - Tại ngân hàng TMCP Thịnh vượng và Phát triển - CN An Giang</w:t>
       </w:r>
     </w:p>
     <w:p>
@@ -740,33 +738,16 @@
           <w:sz w:val="22"/>
           <w:szCs w:val="22"/>
         </w:rPr>
-        <w:t xml:space="preserve">  </w:t>
+        <w:t xml:space="preserve">  Tài khoản (2)</w:t>
       </w:r>
       <w:r>
         <w:rPr>
           <w:rFonts w:ascii="Hyundai Sans Text" w:hAnsi="Hyundai Sans Text" w:cs="Arial"/>
           <w:sz w:val="22"/>
           <w:szCs w:val="22"/>
-          <w:lang w:val="vi-VN"/>
-        </w:rPr>
-        <w:t>Tài khoản</w:t>
-      </w:r>
-      <w:r>
-        <w:rPr>
-          <w:rFonts w:ascii="Hyundai Sans Text" w:hAnsi="Hyundai Sans Text" w:cs="Arial"/>
-          <w:sz w:val="22"/>
-          <w:szCs w:val="22"/>
-        </w:rPr>
-        <w:t xml:space="preserve"> (2)</w:t>
-      </w:r>
-      <w:r>
-        <w:rPr>
-          <w:rFonts w:ascii="Hyundai Sans Text" w:hAnsi="Hyundai Sans Text" w:cs="Arial"/>
-          <w:sz w:val="22"/>
-          <w:szCs w:val="22"/>
         </w:rPr>
         <w:tab/>
-        <w:t>: 1186 4284 6666  -  Tại ngân hàng Công thương  (Vietinbank) - CN An Giang</w:t>
+        <w:t>: 3578 999 999 - Ngân Hàng TMCP Việt Nam Thịnh Vượng – VP Bank</w:t>
       </w:r>
     </w:p>
     <w:p>
@@ -789,16 +770,16 @@
           <w:sz w:val="22"/>
           <w:szCs w:val="22"/>
         </w:rPr>
-        <w:t xml:space="preserve">  </w:t>
+        <w:t xml:space="preserve">  Tài khoản (3)</w:t>
       </w:r>
       <w:r>
         <w:rPr>
           <w:rFonts w:ascii="Hyundai Sans Text" w:hAnsi="Hyundai Sans Text" w:cs="Arial"/>
           <w:sz w:val="22"/>
           <w:szCs w:val="22"/>
-          <w:lang w:val="vi-VN"/>
-        </w:rPr>
-        <w:t>Tài khoản</w:t>
+        </w:rPr>
+        <w:tab/>
+        <w:t>:</w:t>
       </w:r>
       <w:r>
         <w:rPr>
@@ -806,7 +787,7 @@
           <w:sz w:val="22"/>
           <w:szCs w:val="22"/>
         </w:rPr>
-        <w:t xml:space="preserve"> (3)</w:t>
+        <w:t xml:space="preserve"> </w:t>
       </w:r>
       <w:r>
         <w:rPr>
@@ -814,8 +795,7 @@
           <w:sz w:val="22"/>
           <w:szCs w:val="22"/>
         </w:rPr>
-        <w:tab/>
-        <w:t>: 7011 0000 465 200  -  Tại NH TMCP Đầu tư và Phát triển VN (BIDV) - CN An Giang</w:t>
+        <w:t>1352 999 999 - Tại NH TMCP Ngoại thương Việt Nam (Vietcombank) - CN An Giang</w:t>
       </w:r>
     </w:p>
     <w:p>
@@ -827,64 +807,6 @@
         <w:contextualSpacing/>
         <w:jc w:val="both"/>
         <w:rPr>
-          <w:rFonts w:ascii="Hyundai Sans Text" w:hAnsi="Hyundai Sans Text" w:cs="Arial"/>
-          <w:sz w:val="22"/>
-          <w:szCs w:val="22"/>
-        </w:rPr>
-      </w:pPr>
-      <w:r>
-        <w:rPr>
-          <w:rFonts w:ascii="Hyundai Sans Text" w:hAnsi="Hyundai Sans Text" w:cs="Arial"/>
-          <w:sz w:val="22"/>
-          <w:szCs w:val="22"/>
-        </w:rPr>
-        <w:t xml:space="preserve">  </w:t>
-      </w:r>
-      <w:r>
-        <w:rPr>
-          <w:rFonts w:ascii="Hyundai Sans Text" w:hAnsi="Hyundai Sans Text" w:cs="Arial"/>
-          <w:sz w:val="22"/>
-          <w:szCs w:val="22"/>
-          <w:lang w:val="vi-VN"/>
-        </w:rPr>
-        <w:t>Tài khoản</w:t>
-      </w:r>
-      <w:r>
-        <w:rPr>
-          <w:rFonts w:ascii="Hyundai Sans Text" w:hAnsi="Hyundai Sans Text" w:cs="Arial"/>
-          <w:sz w:val="22"/>
-          <w:szCs w:val="22"/>
-        </w:rPr>
-        <w:t xml:space="preserve"> (4)</w:t>
-      </w:r>
-      <w:r>
-        <w:rPr>
-          <w:rFonts w:ascii="Hyundai Sans Text" w:hAnsi="Hyundai Sans Text" w:cs="Arial"/>
-          <w:sz w:val="22"/>
-          <w:szCs w:val="22"/>
-        </w:rPr>
-        <w:tab/>
-        <w:t xml:space="preserve">: 1352 999 999  </w:t>
-      </w:r>
-      <w:r>
-        <w:rPr>
-          <w:rFonts w:ascii="Hyundai Sans Text" w:hAnsi="Hyundai Sans Text" w:cs="Arial"/>
-          <w:spacing w:val="-6"/>
-          <w:sz w:val="22"/>
-          <w:szCs w:val="22"/>
-        </w:rPr>
-        <w:t>-  Tại NH TMCP Ngoại thương Việt Nam (Vietcombank) - CN An Giang</w:t>
-      </w:r>
-    </w:p>
-    <w:p>
-      <w:pPr>
-        <w:tabs>
-          <w:tab w:val="left" w:pos="1800"/>
-        </w:tabs>
-        <w:spacing w:before="60"/>
-        <w:contextualSpacing/>
-        <w:jc w:val="both"/>
-        <w:rPr>
           <w:rFonts w:ascii="TCM Pro" w:hAnsi="TCM Pro" w:cs="Arial"/>
           <w:sz w:val="22"/>
           <w:szCs w:val="22"/>
@@ -913,7 +835,7 @@
           <w:sz w:val="22"/>
           <w:szCs w:val="22"/>
         </w:rPr>
-        <w:t>NGUYỄN HÙNG</w:t>
+        <w:t>LÊ THỊ CHI</w:t>
       </w:r>
       <w:r>
         <w:rPr>
@@ -937,7 +859,7 @@
           <w:sz w:val="22"/>
           <w:szCs w:val="22"/>
         </w:rPr>
-        <w:t>0909114438</w:t>
+        <w:t>0926511025</w:t>
       </w:r>
     </w:p>
     <w:p>
@@ -1013,7 +935,7 @@
           <w:sz w:val="22"/>
           <w:szCs w:val="22"/>
         </w:rPr>
-        <w:t>HUỲNH DUY THANH</w:t>
+        <w:t>TRẦN THỊ THANH THUÝ</w:t>
       </w:r>
     </w:p>
     <w:p>
@@ -1061,7 +983,7 @@
           <w:sz w:val="22"/>
           <w:szCs w:val="22"/>
         </w:rPr>
-        <w:t>Bình Đức 3, Bình Đức, Long Xuyên, An Giang</w:t>
+        <w:t>Ấp Phú Mỹ, Xã An Phú, An Giang</w:t>
       </w:r>
     </w:p>
     <w:p>
@@ -1127,7 +1049,7 @@
           <w:sz w:val="22"/>
           <w:szCs w:val="22"/>
         </w:rPr>
-        <w:t>0939082087</w:t>
+        <w:t>0945986124</w:t>
       </w:r>
     </w:p>
     <w:p>
@@ -1174,7 +1096,7 @@
           <w:sz w:val="22"/>
           <w:szCs w:val="22"/>
         </w:rPr>
-        <w:t xml:space="preserve"> 089087006633</w:t>
+        <w:t xml:space="preserve"> 087184023481</w:t>
       </w:r>
       <w:r>
         <w:rPr>
@@ -1191,7 +1113,7 @@
           <w:szCs w:val="22"/>
         </w:rPr>
         <w:tab/>
-        <w:t>Ngày cấp: 03-09-2024</w:t>
+        <w:t>Ngày cấp: 15-08-1984</w:t>
       </w:r>
       <w:r>
         <w:rPr>
@@ -1207,7 +1129,7 @@
           <w:sz w:val="22"/>
           <w:szCs w:val="22"/>
         </w:rPr>
-        <w:t>Nơi cấp: BỘ CÔNG AN</w:t>
+        <w:t>Nơi cấp: CTCCS</w:t>
       </w:r>
     </w:p>
     <w:p>
@@ -1245,7 +1167,7 @@
           <w:sz w:val="22"/>
           <w:szCs w:val="22"/>
         </w:rPr>
-        <w:t>: 01-10-1987</w:t>
+        <w:t>: 15-08-1984</w:t>
       </w:r>
     </w:p>
     <w:p>
@@ -1283,7 +1205,7 @@
           <w:sz w:val="22"/>
           <w:szCs w:val="22"/>
         </w:rPr>
-        <w:t>: HUỲNH DUY THANH làm đại diện</w:t>
+        <w:t>: TRẦN THỊ THANH THUÝ làm đại diện</w:t>
       </w:r>
     </w:p>
     <w:p>
@@ -1602,13 +1524,13 @@
                 <w:szCs w:val="22"/>
               </w:rPr>
               <w:t>
-                - Xe ô tô 5 chỗ ngồi hiệu HYUNDAI
+                - Xe ô tô 7 chỗ ngồi hiệu HYUNDAI
                 <w:br/>
-                - TUCSON 1.6 F/L TURBO CKD
+                - STARGAZER CAO CẤP FL 2026 CKD
                 <w:br/>
                 - Xe mới 100%, Hộp số: TỰ ĐỘNG
                 <w:br/>
-                - Động cơ 1.6L, Màu sơn: Trắng
+                - Động cơ 1.5L, Màu sơn: Đen
                 <w:br/>
                 - Trang bị kèm theo xe gồm: Theo tiêu chuẩn nhà sản xuất và AVN
                 <w:br/>
@@ -1678,7 +1600,7 @@
                 <w:sz w:val="22"/>
                 <w:szCs w:val="22"/>
               </w:rPr>
-              <w:t>934,000,000</w:t>
+              <w:t>589,000,000</w:t>
             </w:r>
           </w:p>
         </w:tc>
@@ -1711,7 +1633,7 @@
                 <w:sz w:val="22"/>
                 <w:szCs w:val="22"/>
               </w:rPr>
-              <w:t>934,000,000</w:t>
+              <w:t>589,000,000</w:t>
             </w:r>
           </w:p>
         </w:tc>
@@ -1746,170 +1668,6 @@
                 <w:szCs w:val="22"/>
               </w:rPr>
               <w:t>2</w:t>
-            </w:r>
-          </w:p>
-        </w:tc>
-        <w:tc>
-          <w:tcPr>
-            <w:tcW w:w="3470" w:type="dxa"/>
-          </w:tcPr>
-          <w:p>
-            <w:pPr>
-              <w:pStyle w:val="BodyText2"/>
-              <w:tabs>
-                <w:tab w:val="left" w:pos="360"/>
-              </w:tabs>
-              <w:spacing w:after="0" w:line="240" w:lineRule="auto"/>
-              <w:rPr>
-                <w:rFonts w:ascii="TCM Pro" w:hAnsi="TCM Pro" w:cs="Arial"/>
-                <w:bCs/>
-                <w:iCs/>
-                <w:sz w:val="22"/>
-                <w:szCs w:val="22"/>
-              </w:rPr>
-            </w:pPr>
-            <w:r>
-              <w:rPr>
-                <w:rFonts w:ascii="TCM Pro" w:hAnsi="TCM Pro" w:cs="Arial"/>
-                <w:bCs/>
-                <w:iCs/>
-                <w:sz w:val="22"/>
-                <w:szCs w:val="22"/>
-              </w:rPr>
-              <w:t>PHỤ KIỆN</w:t>
-            </w:r>
-          </w:p>
-        </w:tc>
-        <w:tc>
-          <w:tcPr>
-            <w:tcW w:w="2059" w:type="dxa"/>
-            <w:vAlign w:val="center"/>
-          </w:tcPr>
-          <w:p>
-            <w:pPr>
-              <w:pStyle w:val="BodyText2"/>
-              <w:tabs>
-                <w:tab w:val="left" w:pos="360"/>
-              </w:tabs>
-              <w:spacing w:after="0" w:line="240" w:lineRule="auto"/>
-              <w:jc w:val="center"/>
-              <w:rPr>
-                <w:rFonts w:ascii="TCM Pro" w:hAnsi="TCM Pro" w:cs="Arial"/>
-                <w:bCs/>
-                <w:iCs/>
-                <w:sz w:val="22"/>
-                <w:szCs w:val="22"/>
-              </w:rPr>
-            </w:pPr>
-            <w:r>
-              <w:rPr>
-                <w:rFonts w:ascii="TCM Pro" w:hAnsi="TCM Pro" w:cs="Arial"/>
-                <w:bCs/>
-                <w:iCs/>
-                <w:sz w:val="22"/>
-                <w:szCs w:val="22"/>
-              </w:rPr>
-              <w:t>01</w:t>
-            </w:r>
-          </w:p>
-        </w:tc>
-        <w:tc>
-          <w:tcPr>
-            <w:tcW w:w="2059" w:type="dxa"/>
-            <w:vAlign w:val="center"/>
-          </w:tcPr>
-          <w:p>
-            <w:pPr>
-              <w:pStyle w:val="BodyText2"/>
-              <w:tabs>
-                <w:tab w:val="left" w:pos="360"/>
-              </w:tabs>
-              <w:spacing w:after="0" w:line="240" w:lineRule="auto"/>
-              <w:jc w:val="center"/>
-              <w:rPr>
-                <w:rFonts w:ascii="TCM Pro" w:hAnsi="TCM Pro" w:cs="Arial"/>
-                <w:bCs/>
-                <w:iCs/>
-                <w:sz w:val="22"/>
-                <w:szCs w:val="22"/>
-              </w:rPr>
-            </w:pPr>
-            <w:r>
-              <w:rPr>
-                <w:rFonts w:ascii="TCM Pro" w:hAnsi="TCM Pro" w:cs="Arial"/>
-                <w:bCs/>
-                <w:iCs/>
-                <w:sz w:val="22"/>
-                <w:szCs w:val="22"/>
-              </w:rPr>
-              <w:t>5,500,000</w:t>
-            </w:r>
-          </w:p>
-        </w:tc>
-        <w:tc>
-          <w:tcPr>
-            <w:tcW w:w="2060" w:type="dxa"/>
-            <w:vAlign w:val="center"/>
-          </w:tcPr>
-          <w:p>
-            <w:pPr>
-              <w:pStyle w:val="BodyText2"/>
-              <w:tabs>
-                <w:tab w:val="left" w:pos="360"/>
-              </w:tabs>
-              <w:spacing w:after="0" w:line="240" w:lineRule="auto"/>
-              <w:jc w:val="center"/>
-              <w:rPr>
-                <w:rFonts w:ascii="TCM Pro" w:hAnsi="TCM Pro" w:cs="Arial"/>
-                <w:bCs/>
-                <w:iCs/>
-                <w:sz w:val="22"/>
-                <w:szCs w:val="22"/>
-              </w:rPr>
-            </w:pPr>
-            <w:r>
-              <w:rPr>
-                <w:rFonts w:ascii="TCM Pro" w:hAnsi="TCM Pro" w:cs="Arial"/>
-                <w:bCs/>
-                <w:iCs/>
-                <w:sz w:val="22"/>
-                <w:szCs w:val="22"/>
-              </w:rPr>
-              <w:t>5,500,000</w:t>
-            </w:r>
-          </w:p>
-        </w:tc>
-      </w:tr>
-      <w:tr>
-        <w:tc>
-          <w:tcPr>
-            <w:tcW w:w="648" w:type="dxa"/>
-          </w:tcPr>
-          <w:p>
-            <w:pPr>
-              <w:pStyle w:val="BodyText2"/>
-              <w:tabs>
-                <w:tab w:val="left" w:pos="360"/>
-              </w:tabs>
-              <w:spacing w:after="0" w:line="240" w:lineRule="auto"/>
-              <w:jc w:val="center"/>
-              <w:rPr>
-                <w:rFonts w:ascii="TCM Pro" w:hAnsi="TCM Pro" w:cs="Arial"/>
-                <w:bCs/>
-                <w:iCs/>
-                <w:sz w:val="22"/>
-                <w:szCs w:val="22"/>
-              </w:rPr>
-            </w:pPr>
-            <w:r>
-              <w:rPr>
-                <w:rFonts w:ascii="TCM Pro" w:hAnsi="TCM Pro" w:cs="Arial"/>
-                <w:bCs/>
-                <w:iCs/>
-                <w:sz w:val="22"/>
-                <w:szCs w:val="22"/>
-              </w:rPr>
-              <w:t>3</w:t>
             </w:r>
           </w:p>
         </w:tc>
@@ -1997,7 +1755,7 @@
                 <w:sz w:val="22"/>
                 <w:szCs w:val="22"/>
               </w:rPr>
-              <w:t>939,500,000</w:t>
+              <w:t>589,000,000</w:t>
             </w:r>
           </w:p>
         </w:tc>
@@ -2034,7 +1792,7 @@
                 <w:sz w:val="22"/>
                 <w:szCs w:val="22"/>
               </w:rPr>
-              <w:t>(Số tiền bằng chữ: chín trăm  ba mươi chín triệu năm trăm nghìn)</w:t>
+              <w:t>(Số tiền bằng chữ: năm trăm  tám mươi chín triệu)</w:t>
             </w:r>
           </w:p>
         </w:tc>
@@ -2238,17 +1996,7 @@
           <w:sz w:val="22"/>
           <w:szCs w:val="22"/>
         </w:rPr>
-        <w:t>ÁO TRÙM XE 5 CHỖ, VÍ DA HYUNDAI, BAO TAY LÁI KHUYẾN MÃI, Gói bảo dưỡng 1.000km, </w:t>
-      </w:r>
-      <w:r>
-        <w:rPr>
-          <w:rFonts w:ascii="TCM Pro" w:hAnsi="TCM Pro" w:cs="Arial"/>
-          <w:bCs/>
-          <w:iCs/>
-          <w:sz w:val="22"/>
-          <w:szCs w:val="22"/>
-        </w:rPr>
-        <w:t>.</w:t>
+        <w:t>Áo trùm xe 7 chỗ, Bao tay lái cơ bản, Phim cách nhiệt JAF toàn xe KS, Camera hành trình SR06 + thẻ nhớ 32GB, Phủ gầm gốc nước Jasso 1 lớp xe 7 chỗ (5C) KM, Trải sàn da 360 vân 3D - Xe 7C (KS 2026), Ví da, Dù Hyundai, Tẩu sạc lắp cam, </w:t>
       </w:r>
     </w:p>
     <w:p>
@@ -4187,7 +3935,7 @@
         </w:rPr>
         <w:t xml:space="preserve">Bên B có trách nhiệm sử dụng xe theo đúng hướng dẫn sử dụng của Bên A. Thông tin chi tiết về hướng dẫn sử dụng sản phẩm được công bố tại website </w:t>
       </w:r>
-      <w:hyperlink r:id="rId7" w:history="1">
+      <w:hyperlink r:id="rId8" w:history="1">
         <w:r>
           <w:rPr>
             <w:rStyle w:val="Hyperlink"/>
@@ -5152,8 +4900,8 @@
       </w:pPr>
     </w:p>
     <w:sectPr>
-      <w:headerReference w:type="default" r:id="rId8"/>
-      <w:footerReference w:type="default" r:id="rId9"/>
+      <w:headerReference w:type="default" r:id="rId9"/>
+      <w:footerReference w:type="default" r:id="rId10"/>
       <w:pgSz w:w="12240" w:h="15840"/>
       <w:pgMar w:top="450" w:right="720" w:bottom="180" w:left="1440" w:header="1152" w:footer="0" w:gutter="0"/>
       <w:cols w:space="720"/>
@@ -5229,7 +4977,7 @@
       <mc:AlternateContent>
         <mc:Choice Requires="wpg">
           <w:drawing>
-            <wp:anchor distT="0" distB="0" distL="114300" distR="114300" simplePos="0" relativeHeight="251657216" behindDoc="0" locked="0" layoutInCell="1" allowOverlap="1" wp14:anchorId="765CD418" wp14:editId="62418D69">
+            <wp:anchor distT="0" distB="0" distL="114300" distR="114300" simplePos="0" relativeHeight="251657216" behindDoc="0" locked="0" layoutInCell="1" allowOverlap="1" wp14:anchorId="2135F854" wp14:editId="2E8483B6">
               <wp:simplePos x="0" y="0"/>
               <wp:positionH relativeFrom="column">
                 <wp:posOffset>213360</wp:posOffset>
@@ -5362,7 +5110,7 @@
         </mc:Choice>
         <mc:Fallback>
           <w:pict>
-            <v:group w14:anchorId="765CD418" id="Group 1" o:spid="_x0000_s1026" style="position:absolute;margin-left:16.8pt;margin-top:-30.05pt;width:490.8pt;height:47.1pt;z-index:251657216;mso-width-relative:margin" coordorigin="5697" coordsize="62331,5978" o:gfxdata="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">
+            <v:group w14:anchorId="2135F854" id="Group 1" o:spid="_x0000_s1026" style="position:absolute;margin-left:16.8pt;margin-top:-30.05pt;width:490.8pt;height:47.1pt;z-index:251657216;mso-width-relative:margin" coordorigin="5697" coordsize="62331,5978" o:gfxdata="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">
               <v:shapetype id="_x0000_t75" coordsize="21600,21600" o:spt="75" o:preferrelative="t" path="m@4@5l@4@11@9@11@9@5xe" filled="f" stroked="f">
                 <v:stroke joinstyle="miter"/>
                 <v:formulas>
@@ -5949,22 +5697,22 @@
       </w:pPr>
     </w:lvl>
   </w:abstractNum>
-  <w:num w:numId="1" w16cid:durableId="125204783">
+  <w:num w:numId="1" w16cid:durableId="795415418">
     <w:abstractNumId w:val="1"/>
   </w:num>
-  <w:num w:numId="2" w16cid:durableId="1996639508">
+  <w:num w:numId="2" w16cid:durableId="1282230588">
     <w:abstractNumId w:val="2"/>
   </w:num>
-  <w:num w:numId="3" w16cid:durableId="190074115">
+  <w:num w:numId="3" w16cid:durableId="760297520">
     <w:abstractNumId w:val="0"/>
   </w:num>
-  <w:num w:numId="4" w16cid:durableId="337003656">
+  <w:num w:numId="4" w16cid:durableId="1354259575">
     <w:abstractNumId w:val="3"/>
   </w:num>
-  <w:num w:numId="5" w16cid:durableId="21784934">
+  <w:num w:numId="5" w16cid:durableId="72049856">
     <w:abstractNumId w:val="1"/>
   </w:num>
-  <w:num w:numId="6" w16cid:durableId="1236404297">
+  <w:num w:numId="6" w16cid:durableId="1697004861">
     <w:abstractNumId w:val="2"/>
     <w:lvlOverride w:ilvl="0">
       <w:startOverride w:val="4"/>
@@ -6632,7 +6380,7 @@
     <w:name w:val="Body Text 2 Char"/>
     <w:basedOn w:val="DefaultParagraphFont"/>
     <w:link w:val="BodyText2"/>
-    <w:rsid w:val="005347A3"/>
+    <w:rsid w:val="007B4861"/>
     <w:rPr>
       <w:rFonts w:eastAsia="MS Mincho"/>
       <w:sz w:val="24"/>
@@ -6925,4 +6673,16 @@
   <a:objectDefaults/>
   <a:extraClrSchemeLst/>
 </a:theme>
+</file>
+
+<file path=customXml/item1.xml><?xml version="1.0" encoding="utf-8"?>
+<b:Sources xmlns:b="http://schemas.openxmlformats.org/officeDocument/2006/bibliography" xmlns="http://schemas.openxmlformats.org/officeDocument/2006/bibliography" SelectedStyle="\APA.XSL" StyleName="APA"/>
+</file>
+
+<file path=customXml/itemProps1.xml><?xml version="1.0" encoding="utf-8"?>
+<ds:datastoreItem xmlns:ds="http://schemas.openxmlformats.org/officeDocument/2006/customXml" ds:itemID="{281D6E7C-FD08-4CE8-99C6-0EEDA281CC8F}">
+  <ds:schemaRefs>
+    <ds:schemaRef ds:uri="http://schemas.openxmlformats.org/officeDocument/2006/bibliography"/>
+  </ds:schemaRefs>
+</ds:datastoreItem>
 </file>
</xml_diff>